<commit_message>
Note de concept : encadré « En bref » et couverture des tronçons ; inventaire : déclaration de l'outil d'IA
</commit_message>
<xml_diff>
--- a/docs/Inventaire_des_sources_TefesSat.docx
+++ b/docs/Inventaire_des_sources_TefesSat.docx
@@ -2286,7 +2286,7 @@
                 <w:sz w:val="19"/>
                 <w:szCs w:val="19"/>
               </w:rPr>
-              <w:t xml:space="preserve">Claude (Anthropic), assistant de programmation Claude Code</w:t>
+              <w:t xml:space="preserve">Claude (Anthropic), assistant d’IA générative</w:t>
             </w:r>
           </w:p>
         </w:tc>
@@ -2344,7 +2344,7 @@
                 <w:sz w:val="19"/>
                 <w:szCs w:val="19"/>
               </w:rPr>
-              <w:t xml:space="preserve">Aide à l’écriture et à la relecture des scripts Python, à la rédaction et à la mise en forme des documents (note de concept, présentation, inventaire)</w:t>
+              <w:t xml:space="preserve">Aide à la programmation (scripts Python) et à la rédaction des documents ; résultats vérifiés par l’équipe</w:t>
             </w:r>
           </w:p>
         </w:tc>

</xml_diff>

<commit_message>
Inventaire des sources : liens des articles (digue PPCS ADM/AFD, relogement SERRP, brèche de 2003)
</commit_message>
<xml_diff>
--- a/docs/Inventaire_des_sources_TefesSat.docx
+++ b/docs/Inventaire_des_sources_TefesSat.docx
@@ -1439,7 +1439,7 @@
         </w:numPr>
       </w:pPr>
       <w:r>
-        <w:t xml:space="preserve">Construction de la digue de protection de Goxu Mbacc au quai de pêche de Guet Ndar (environ 2,1 km, travaux de janvier 2021 à juillet 2022) : articles de presse (Ndarinfo, EnQuêtePlus, Teranga News) et documents publics du projet de la Banque mondiale (plan d’action de réinstallation). [Liens exacts à ajouter]</w:t>
+        <w:t xml:space="preserve">Digue de protection côtière (Projet de Protection Côtière de Saint-Louis, maître d’ouvrage ADM, financement État du Sénégal et AFD) : 2 150 m d’enrochements, travaux lancés en janvier 2021. Ndarinfo, « Digue de protection côtière de Saint-Louis : le démarrage des travaux effectif » : https://www.ndarinfo.com/DIGUE-DE-PROTECTION-COTIERE-DE-SAINT-LOUIS-Le-demarrage-des-travaux-effectif--selon-Gerard-SENAC_a30427.html</w:t>
       </w:r>
     </w:p>
     <w:p>
@@ -1451,7 +1451,67 @@
         </w:numPr>
       </w:pPr>
       <w:r>
-        <w:t xml:space="preserve">Ouverture de la brèche en 2003 et relogements après les houles de 2017–2018 : sources de presse et documents publics. [Liens exacts à ajouter]</w:t>
+        <w:t xml:space="preserve">Avancement de la digue (53 % en octobre 2021, fin visée en avril 2022). Ndarinfo : https://www.ndarinfo.com/Saint-Louis-La-digue-de-protection-cotiere-realisee-a-53-video_a32599.html</w:t>
+      </w:r>
+    </w:p>
+    <w:p>
+      <w:pPr>
+        <w:pStyle w:val="ListParagraph"/>
+        <w:numPr>
+          <w:ilvl w:val="0"/>
+          <w:numId w:val="2"/>
+        </w:numPr>
+      </w:pPr>
+      <w:r>
+        <w:t xml:space="preserve">Évaluation du projet par l’AFD (2025) : https://www.afd.fr/sites/default/files/2026-01/2025_csn1561_evaluationprojet_resume_fr.pdf</w:t>
+      </w:r>
+    </w:p>
+    <w:p>
+      <w:pPr>
+        <w:pStyle w:val="ListParagraph"/>
+        <w:numPr>
+          <w:ilvl w:val="0"/>
+          <w:numId w:val="2"/>
+        </w:numPr>
+      </w:pPr>
+      <w:r>
+        <w:t xml:space="preserve">Relogement des familles de la bande des 20 m (projet SERRP, Banque mondiale) : Plan d’action de réinstallation de la Langue de Barbarie, rapport final, avril 2020 : https://documents1.worldbank.org/curated/en/563401588360092073/pdf/Plan-dAction-de-R%C3%A9installation-de-la-Langue-Barbarie.pdf</w:t>
+      </w:r>
+    </w:p>
+    <w:p>
+      <w:pPr>
+        <w:pStyle w:val="ListParagraph"/>
+        <w:numPr>
+          <w:ilvl w:val="0"/>
+          <w:numId w:val="2"/>
+        </w:numPr>
+      </w:pPr>
+      <w:r>
+        <w:t xml:space="preserve">Ouverture de la brèche en 2003. Ndarinfo, « Comment la première brèche a été ouverte sur la Langue de Barbarie en 2003 » : https://www.ndarinfo.com/EXCLUSIF-Saint-Louis-Comment-la-premiere-breche-a-ete-ouverte-sur-la-langue-de-barbarie-en-2003_a4505.html</w:t>
+      </w:r>
+    </w:p>
+    <w:p>
+      <w:pPr>
+        <w:pStyle w:val="ListParagraph"/>
+        <w:numPr>
+          <w:ilvl w:val="0"/>
+          <w:numId w:val="2"/>
+        </w:numPr>
+      </w:pPr>
+      <w:r>
+        <w:t xml:space="preserve">Disparition du village de Doun Baba Dièye. Ndarinfo, « Doune Baba Dièye n’existe plus » : https://www.ndarinfo.com/Saint-Louis-Doune-Baba-Dieye-n-existe-plus_a4597.html</w:t>
+      </w:r>
+    </w:p>
+    <w:p>
+      <w:pPr>
+        <w:pStyle w:val="ListParagraph"/>
+        <w:numPr>
+          <w:ilvl w:val="0"/>
+          <w:numId w:val="2"/>
+        </w:numPr>
+      </w:pPr>
+      <w:r>
+        <w:t xml:space="preserve">Sites consultés le 20 octobre 2026.</w:t>
       </w:r>
     </w:p>
     <w:p>

</xml_diff>

<commit_message>
Traits de côte CoastSat d'Abdoulaye intégrés au nord : contrôle à deux méthodes, zone de la digue projetée, couverture 92 % ; fichier CoastSat rangé dans donnees/
</commit_message>
<xml_diff>
--- a/docs/Inventaire_des_sources_TefesSat.docx
+++ b/docs/Inventaire_des_sources_TefesSat.docx
@@ -673,7 +673,7 @@
                 <w:sz w:val="19"/>
                 <w:szCs w:val="19"/>
               </w:rPr>
-              <w:t xml:space="preserve">Sentinel-1 RTC (Copernicus, ESA)</w:t>
+              <w:t xml:space="preserve">Sentinel-2 via CoastSat (traitement : Abdoulaye DIOUF)</w:t>
             </w:r>
           </w:p>
         </w:tc>
@@ -703,7 +703,7 @@
                 <w:sz w:val="19"/>
                 <w:szCs w:val="19"/>
               </w:rPr>
-              <w:t xml:space="preserve">3 images : 26/02/2019, 24/01/2023, 01/01/2025. Polarisation VV</w:t>
+              <w:t xml:space="preserve">372 traits de côte, du 27/08/2015 à 2025, nord de la zone (15,97–16,06° N : Hydrobase – Goxu Mbacc) ; notebook extraction_saint_louis.ipynb</w:t>
             </w:r>
           </w:p>
         </w:tc>
@@ -763,7 +763,7 @@
                 <w:sz w:val="19"/>
                 <w:szCs w:val="19"/>
               </w:rPr>
-              <w:t xml:space="preserve">Données Copernicus ; traitement RTC publié par Microsoft Planetary Computer (licence indiquée sur la fiche de la collection)</w:t>
+              <w:t xml:space="preserve">Données Copernicus ; outil CoastSat (Vos et al., 2019, licence libre)</w:t>
             </w:r>
           </w:p>
         </w:tc>
@@ -793,7 +793,7 @@
                 <w:sz w:val="19"/>
                 <w:szCs w:val="19"/>
               </w:rPr>
-              <w:t xml:space="preserve">Microsoft Planetary Computer, collection sentinel-1-rtc</w:t>
+              <w:t xml:space="preserve">Dépôt de l’équipe : donnees/traits_de_cote_coastsat.geojson</w:t>
             </w:r>
           </w:p>
         </w:tc>
@@ -827,7 +827,7 @@
                 <w:sz w:val="19"/>
                 <w:szCs w:val="19"/>
               </w:rPr>
-              <w:t xml:space="preserve">Copernicus DEM GLO-30</w:t>
+              <w:t xml:space="preserve">Sentinel-1 RTC (Copernicus, ESA)</w:t>
             </w:r>
           </w:p>
         </w:tc>
@@ -856,7 +856,7 @@
                 <w:sz w:val="19"/>
                 <w:szCs w:val="19"/>
               </w:rPr>
-              <w:t xml:space="preserve">Modèle numérique de surface, acquisitions 2011–2015</w:t>
+              <w:t xml:space="preserve">3 images : 26/02/2019, 24/01/2023, 01/01/2025. Polarisation VV</w:t>
             </w:r>
           </w:p>
         </w:tc>
@@ -885,7 +885,7 @@
                 <w:sz w:val="19"/>
                 <w:szCs w:val="19"/>
               </w:rPr>
-              <w:t xml:space="preserve">30 m</w:t>
+              <w:t xml:space="preserve">10 m</w:t>
             </w:r>
           </w:p>
         </w:tc>
@@ -914,7 +914,7 @@
                 <w:sz w:val="19"/>
                 <w:szCs w:val="19"/>
               </w:rPr>
-              <w:t xml:space="preserve">Licence Copernicus DEM, gratuite avec attribution : © DLR e.V. 2010-2014 et © Airbus Defence and Space GmbH 2014-2018, fournis dans le cadre de COPERNICUS par l’Union européenne et l’ESA</w:t>
+              <w:t xml:space="preserve">Données Copernicus ; traitement RTC publié par Microsoft Planetary Computer (licence indiquée sur la fiche de la collection)</w:t>
             </w:r>
           </w:p>
         </w:tc>
@@ -943,7 +943,7 @@
                 <w:sz w:val="19"/>
                 <w:szCs w:val="19"/>
               </w:rPr>
-              <w:t xml:space="preserve">Microsoft Planetary Computer, collection cop-dem-glo-30</w:t>
+              <w:t xml:space="preserve">Microsoft Planetary Computer, collection sentinel-1-rtc</w:t>
             </w:r>
           </w:p>
         </w:tc>
@@ -978,7 +978,7 @@
                 <w:sz w:val="19"/>
                 <w:szCs w:val="19"/>
               </w:rPr>
-              <w:t xml:space="preserve">WorldPop 2025, version contrainte (R2024B)</w:t>
+              <w:t xml:space="preserve">Copernicus DEM GLO-30</w:t>
             </w:r>
           </w:p>
         </w:tc>
@@ -1008,7 +1008,7 @@
                 <w:sz w:val="19"/>
                 <w:szCs w:val="19"/>
               </w:rPr>
-              <w:t xml:space="preserve">Nombre d’habitants par carré, Sénégal, 2025</w:t>
+              <w:t xml:space="preserve">Modèle numérique de surface, acquisitions 2011–2015</w:t>
             </w:r>
           </w:p>
         </w:tc>
@@ -1038,7 +1038,7 @@
                 <w:sz w:val="19"/>
                 <w:szCs w:val="19"/>
               </w:rPr>
-              <w:t xml:space="preserve">100 m</w:t>
+              <w:t xml:space="preserve">30 m</w:t>
             </w:r>
           </w:p>
         </w:tc>
@@ -1068,7 +1068,7 @@
                 <w:sz w:val="19"/>
                 <w:szCs w:val="19"/>
               </w:rPr>
-              <w:t xml:space="preserve">CC BY 4.0, © WorldPop (University of Southampton)</w:t>
+              <w:t xml:space="preserve">Licence Copernicus DEM, gratuite avec attribution : © DLR e.V. 2010-2014 et © Airbus Defence and Space GmbH 2014-2018, fournis dans le cadre de COPERNICUS par l’Union européenne et l’ESA</w:t>
             </w:r>
           </w:p>
         </w:tc>
@@ -1098,7 +1098,7 @@
                 <w:sz w:val="19"/>
                 <w:szCs w:val="19"/>
               </w:rPr>
-              <w:t xml:space="preserve">data.worldpop.org</w:t>
+              <w:t xml:space="preserve">Microsoft Planetary Computer, collection cop-dem-glo-30</w:t>
             </w:r>
           </w:p>
         </w:tc>
@@ -1132,7 +1132,7 @@
                 <w:sz w:val="19"/>
                 <w:szCs w:val="19"/>
               </w:rPr>
-              <w:t xml:space="preserve">OpenStreetMap</w:t>
+              <w:t xml:space="preserve">WorldPop 2025, version contrainte (R2024B)</w:t>
             </w:r>
           </w:p>
         </w:tc>
@@ -1161,7 +1161,7 @@
                 <w:sz w:val="19"/>
                 <w:szCs w:val="19"/>
               </w:rPr>
-              <w:t xml:space="preserve">Bâtiments (44 052), écoles, lieux de culte, structures de santé (409), lieux nommés (59), extraits le 19/10/2026</w:t>
+              <w:t xml:space="preserve">Nombre d’habitants par carré, Sénégal, 2025</w:t>
             </w:r>
           </w:p>
         </w:tc>
@@ -1190,7 +1190,7 @@
                 <w:sz w:val="19"/>
                 <w:szCs w:val="19"/>
               </w:rPr>
-              <w:t xml:space="preserve">–</w:t>
+              <w:t xml:space="preserve">100 m</w:t>
             </w:r>
           </w:p>
         </w:tc>
@@ -1219,7 +1219,7 @@
                 <w:sz w:val="19"/>
                 <w:szCs w:val="19"/>
               </w:rPr>
-              <w:t xml:space="preserve">ODbL, © les contributeurs d’OpenStreetMap</w:t>
+              <w:t xml:space="preserve">CC BY 4.0, © WorldPop (University of Southampton)</w:t>
             </w:r>
           </w:p>
         </w:tc>
@@ -1248,7 +1248,7 @@
                 <w:sz w:val="19"/>
                 <w:szCs w:val="19"/>
               </w:rPr>
-              <w:t xml:space="preserve">API Overpass</w:t>
+              <w:t xml:space="preserve">data.worldpop.org</w:t>
             </w:r>
           </w:p>
         </w:tc>
@@ -1283,6 +1283,160 @@
                 <w:sz w:val="19"/>
                 <w:szCs w:val="19"/>
               </w:rPr>
+              <w:t xml:space="preserve">OpenStreetMap</w:t>
+            </w:r>
+          </w:p>
+        </w:tc>
+        <w:tc>
+          <w:tcPr>
+            <w:tcW w:type="dxa" w:w="2900"/>
+            <w:tcBorders>
+              <w:top w:val="single" w:color="CFDCD9" w:sz="4"/>
+              <w:left w:val="single" w:color="CFDCD9" w:sz="4"/>
+              <w:bottom w:val="single" w:color="CFDCD9" w:sz="4"/>
+              <w:right w:val="single" w:color="CFDCD9" w:sz="4"/>
+            </w:tcBorders>
+            <w:shd w:fill="F5F9F8" w:color="auto" w:val="clear"/>
+            <w:tcMar>
+              <w:top w:type="dxa" w:w="50"/>
+              <w:left w:type="dxa" w:w="90"/>
+              <w:bottom w:type="dxa" w:w="50"/>
+              <w:right w:type="dxa" w:w="90"/>
+            </w:tcMar>
+          </w:tcPr>
+          <w:p>
+            <w:pPr>
+              <w:jc w:val="left"/>
+            </w:pPr>
+            <w:r>
+              <w:rPr>
+                <w:sz w:val="19"/>
+                <w:szCs w:val="19"/>
+              </w:rPr>
+              <w:t xml:space="preserve">Bâtiments (44 052), écoles, lieux de culte, structures de santé (409), lieux nommés (59), extraits le 19/10/2026</w:t>
+            </w:r>
+          </w:p>
+        </w:tc>
+        <w:tc>
+          <w:tcPr>
+            <w:tcW w:type="dxa" w:w="1000"/>
+            <w:tcBorders>
+              <w:top w:val="single" w:color="CFDCD9" w:sz="4"/>
+              <w:left w:val="single" w:color="CFDCD9" w:sz="4"/>
+              <w:bottom w:val="single" w:color="CFDCD9" w:sz="4"/>
+              <w:right w:val="single" w:color="CFDCD9" w:sz="4"/>
+            </w:tcBorders>
+            <w:shd w:fill="F5F9F8" w:color="auto" w:val="clear"/>
+            <w:tcMar>
+              <w:top w:type="dxa" w:w="50"/>
+              <w:left w:type="dxa" w:w="90"/>
+              <w:bottom w:type="dxa" w:w="50"/>
+              <w:right w:type="dxa" w:w="90"/>
+            </w:tcMar>
+          </w:tcPr>
+          <w:p>
+            <w:pPr>
+              <w:jc w:val="left"/>
+            </w:pPr>
+            <w:r>
+              <w:rPr>
+                <w:sz w:val="19"/>
+                <w:szCs w:val="19"/>
+              </w:rPr>
+              <w:t xml:space="preserve">–</w:t>
+            </w:r>
+          </w:p>
+        </w:tc>
+        <w:tc>
+          <w:tcPr>
+            <w:tcW w:type="dxa" w:w="2500"/>
+            <w:tcBorders>
+              <w:top w:val="single" w:color="CFDCD9" w:sz="4"/>
+              <w:left w:val="single" w:color="CFDCD9" w:sz="4"/>
+              <w:bottom w:val="single" w:color="CFDCD9" w:sz="4"/>
+              <w:right w:val="single" w:color="CFDCD9" w:sz="4"/>
+            </w:tcBorders>
+            <w:shd w:fill="F5F9F8" w:color="auto" w:val="clear"/>
+            <w:tcMar>
+              <w:top w:type="dxa" w:w="50"/>
+              <w:left w:type="dxa" w:w="90"/>
+              <w:bottom w:type="dxa" w:w="50"/>
+              <w:right w:type="dxa" w:w="90"/>
+            </w:tcMar>
+          </w:tcPr>
+          <w:p>
+            <w:pPr>
+              <w:jc w:val="left"/>
+            </w:pPr>
+            <w:r>
+              <w:rPr>
+                <w:sz w:val="19"/>
+                <w:szCs w:val="19"/>
+              </w:rPr>
+              <w:t xml:space="preserve">ODbL, © les contributeurs d’OpenStreetMap</w:t>
+            </w:r>
+          </w:p>
+        </w:tc>
+        <w:tc>
+          <w:tcPr>
+            <w:tcW w:type="dxa" w:w="1992"/>
+            <w:tcBorders>
+              <w:top w:val="single" w:color="CFDCD9" w:sz="4"/>
+              <w:left w:val="single" w:color="CFDCD9" w:sz="4"/>
+              <w:bottom w:val="single" w:color="CFDCD9" w:sz="4"/>
+              <w:right w:val="single" w:color="CFDCD9" w:sz="4"/>
+            </w:tcBorders>
+            <w:shd w:fill="F5F9F8" w:color="auto" w:val="clear"/>
+            <w:tcMar>
+              <w:top w:type="dxa" w:w="50"/>
+              <w:left w:type="dxa" w:w="90"/>
+              <w:bottom w:type="dxa" w:w="50"/>
+              <w:right w:type="dxa" w:w="90"/>
+            </w:tcMar>
+          </w:tcPr>
+          <w:p>
+            <w:pPr>
+              <w:jc w:val="left"/>
+            </w:pPr>
+            <w:r>
+              <w:rPr>
+                <w:sz w:val="19"/>
+                <w:szCs w:val="19"/>
+              </w:rPr>
+              <w:t xml:space="preserve">API Overpass</w:t>
+            </w:r>
+          </w:p>
+        </w:tc>
+      </w:tr>
+      <w:tr>
+        <w:trPr>
+          <w:cantSplit/>
+        </w:trPr>
+        <w:tc>
+          <w:tcPr>
+            <w:tcW w:type="dxa" w:w="1700"/>
+            <w:tcBorders>
+              <w:top w:val="single" w:color="CFDCD9" w:sz="4"/>
+              <w:left w:val="single" w:color="CFDCD9" w:sz="4"/>
+              <w:bottom w:val="single" w:color="CFDCD9" w:sz="4"/>
+              <w:right w:val="single" w:color="CFDCD9" w:sz="4"/>
+            </w:tcBorders>
+            <w:tcMar>
+              <w:top w:type="dxa" w:w="50"/>
+              <w:left w:type="dxa" w:w="90"/>
+              <w:bottom w:type="dxa" w:w="50"/>
+              <w:right w:type="dxa" w:w="90"/>
+            </w:tcMar>
+          </w:tcPr>
+          <w:p>
+            <w:pPr>
+              <w:jc w:val="left"/>
+            </w:pPr>
+            <w:r>
+              <w:rPr>
+                <w:sz w:val="19"/>
+                <w:szCs w:val="19"/>
+              </w:rPr>
               <w:t xml:space="preserve">Google Open Buildings et Microsoft Building Footprints</w:t>
             </w:r>
           </w:p>
@@ -1296,7 +1450,6 @@
               <w:bottom w:val="single" w:color="CFDCD9" w:sz="4"/>
               <w:right w:val="single" w:color="CFDCD9" w:sz="4"/>
             </w:tcBorders>
-            <w:shd w:fill="F5F9F8" w:color="auto" w:val="clear"/>
             <w:tcMar>
               <w:top w:type="dxa" w:w="50"/>
               <w:left w:type="dxa" w:w="90"/>
@@ -1326,7 +1479,6 @@
               <w:bottom w:val="single" w:color="CFDCD9" w:sz="4"/>
               <w:right w:val="single" w:color="CFDCD9" w:sz="4"/>
             </w:tcBorders>
-            <w:shd w:fill="F5F9F8" w:color="auto" w:val="clear"/>
             <w:tcMar>
               <w:top w:type="dxa" w:w="50"/>
               <w:left w:type="dxa" w:w="90"/>
@@ -1356,7 +1508,6 @@
               <w:bottom w:val="single" w:color="CFDCD9" w:sz="4"/>
               <w:right w:val="single" w:color="CFDCD9" w:sz="4"/>
             </w:tcBorders>
-            <w:shd w:fill="F5F9F8" w:color="auto" w:val="clear"/>
             <w:tcMar>
               <w:top w:type="dxa" w:w="50"/>
               <w:left w:type="dxa" w:w="90"/>
@@ -1386,7 +1537,6 @@
               <w:bottom w:val="single" w:color="CFDCD9" w:sz="4"/>
               <w:right w:val="single" w:color="CFDCD9" w:sz="4"/>
             </w:tcBorders>
-            <w:shd w:fill="F5F9F8" w:color="auto" w:val="clear"/>
             <w:tcMar>
               <w:top w:type="dxa" w:w="50"/>
               <w:left w:type="dxa" w:w="90"/>

</xml_diff>

<commit_message>
Sud CoastSat d'Abdoulaye intégré (ajouté à nos données) ; validation à deux méthodes au nord et au sud ; rangement de ses fichiers ; lien du prototype dans la note
</commit_message>
<xml_diff>
--- a/docs/Inventaire_des_sources_TefesSat.docx
+++ b/docs/Inventaire_des_sources_TefesSat.docx
@@ -703,7 +703,7 @@
                 <w:sz w:val="19"/>
                 <w:szCs w:val="19"/>
               </w:rPr>
-              <w:t xml:space="preserve">372 traits de côte, du 27/08/2015 à 2025, nord de la zone (15,97–16,06° N : Hydrobase – Goxu Mbacc) ; notebook extraction_saint_louis.ipynb</w:t>
+              <w:t xml:space="preserve">Nord : 372 traits de côte, 27/08/2015 – 2025 (15,97–16,06° N, Hydrobase – Goxu Mbacc), notebook extraction_saint_louis.ipynb. Sud : 265 traits de côte, 2016 – 2025 (15,87–15,98° N, brèche, Guéthie), notebook extraction_saint_louis_sud.ipynb</w:t>
             </w:r>
           </w:p>
         </w:tc>
@@ -793,7 +793,7 @@
                 <w:sz w:val="19"/>
                 <w:szCs w:val="19"/>
               </w:rPr>
-              <w:t xml:space="preserve">Dépôt de l’équipe : donnees/traits_de_cote_coastsat.geojson</w:t>
+              <w:t xml:space="preserve">Dépôt de l’équipe : donnees/traits_de_cote_coastsat.geojson et donnees/traits_de_cote_coastsat_sud.geojson</w:t>
             </w:r>
           </w:p>
         </w:tc>

</xml_diff>